<commit_message>
fix(b2b-generator): e-mail Partnera w §12 z „Dane Partnera", nie żółty placeholder
W szablonie pozostało żółte pole w sekcji doręczeń (§12):
  „Dla Partnera: Adres e-mail Partnera wskazany w komparycji Umowy."
  (EN: „For the Partner: The Partner's email address indicated in the preamble…")

Teraz podstawia się tam e-mail Partnera podany w „Dane Partnera (firma)"
({{ candidate.email }}). E-mail B2BNET (administracja@b2bnetwork.pl) zostaje
stały. Reguły w build_b2b_templates + re-run → 4 artefakty; seeder UPSERT
odświeża szablon w DB przy deployu.

Zweryfikowane render PL+EN: „Dla Partnera: anna@firma.pl" / „For the Partner:
anna@firma.pl"; B2BNET stały; żółty placeholder zniknął; 13 testów zielonych.

Co-Authored-By: Claude Opus 4.8 (1M context) <noreply@anthropic.com>
</commit_message>
<xml_diff>
--- a/backend/app/templates/contract/umowa_b2b_en.docx
+++ b/backend/app/templates/contract/umowa_b2b_en.docx
@@ -4956,33 +4956,8 @@
           <w:lang w:val="en-US"/>
         </w:rPr>
         <w:t>•</w:t>
-      </w:r>
-      <w:r>
-        <w:rPr>
-          <w:lang w:val="en-US"/>
-        </w:rPr>
         <w:tab/>
-      </w:r>
-      <w:r>
-        <w:rPr>
-          <w:rFonts w:ascii="Aptos" w:eastAsia="Aptos" w:hAnsi="Aptos" w:cs="Aptos"/>
-          <w:color w:val="auto"/>
-          <w:sz w:val="20"/>
-          <w:szCs w:val="20"/>
-          <w:lang w:val="en-US"/>
-        </w:rPr>
-        <w:t xml:space="preserve">For the Partner: </w:t>
-      </w:r>
-      <w:r>
-        <w:rPr>
-          <w:rFonts w:ascii="Aptos" w:eastAsia="Aptos" w:hAnsi="Aptos" w:cs="Aptos"/>
-          <w:color w:val="auto"/>
-          <w:sz w:val="20"/>
-          <w:szCs w:val="20"/>
-          <w:highlight w:val="yellow"/>
-          <w:lang w:val="en-US"/>
-        </w:rPr>
-        <w:t>The Partner's email address indicated in the preamble to the Agreement.</w:t>
+        <w:t>For the Partner: {{ candidate.email or '………' }}</w:t>
       </w:r>
     </w:p>
     <w:p>

</xml_diff>

<commit_message>
fix(b2b-generator): e-mail Partnera w §12 z „Dane Partnera", nie żółty placeholder (#436)
W szablonie pozostało żółte pole w sekcji doręczeń (§12):
  „Dla Partnera: Adres e-mail Partnera wskazany w komparycji Umowy."
  (EN: „For the Partner: The Partner's email address indicated in the preamble…")

Teraz podstawia się tam e-mail Partnera podany w „Dane Partnera (firma)"
({{ candidate.email }}). E-mail B2BNET (administracja@b2bnetwork.pl) zostaje
stały. Reguły w build_b2b_templates + re-run → 4 artefakty; seeder UPSERT
odświeża szablon w DB przy deployu.

Zweryfikowane render PL+EN: „Dla Partnera: anna@firma.pl" / „For the Partner:
anna@firma.pl"; B2BNET stały; żółty placeholder zniknął; 13 testów zielonych.

Co-authored-by: Claude Opus 4.8 (1M context) <noreply@anthropic.com>
</commit_message>
<xml_diff>
--- a/backend/app/templates/contract/umowa_b2b_en.docx
+++ b/backend/app/templates/contract/umowa_b2b_en.docx
@@ -4956,33 +4956,8 @@
           <w:lang w:val="en-US"/>
         </w:rPr>
         <w:t>•</w:t>
-      </w:r>
-      <w:r>
-        <w:rPr>
-          <w:lang w:val="en-US"/>
-        </w:rPr>
         <w:tab/>
-      </w:r>
-      <w:r>
-        <w:rPr>
-          <w:rFonts w:ascii="Aptos" w:eastAsia="Aptos" w:hAnsi="Aptos" w:cs="Aptos"/>
-          <w:color w:val="auto"/>
-          <w:sz w:val="20"/>
-          <w:szCs w:val="20"/>
-          <w:lang w:val="en-US"/>
-        </w:rPr>
-        <w:t xml:space="preserve">For the Partner: </w:t>
-      </w:r>
-      <w:r>
-        <w:rPr>
-          <w:rFonts w:ascii="Aptos" w:eastAsia="Aptos" w:hAnsi="Aptos" w:cs="Aptos"/>
-          <w:color w:val="auto"/>
-          <w:sz w:val="20"/>
-          <w:szCs w:val="20"/>
-          <w:highlight w:val="yellow"/>
-          <w:lang w:val="en-US"/>
-        </w:rPr>
-        <w:t>The Partner's email address indicated in the preamble to the Agreement.</w:t>
+        <w:t>For the Partner: {{ candidate.email or '………' }}</w:t>
       </w:r>
     </w:p>
     <w:p>

</xml_diff>

<commit_message>
fix(b2b-generator): usuń wiersz „Szczegółowy zakres Usług" z Załącznika nr 3
Decyzja Artura (2026-06-06): w Zał.3 ma być tylko Klient / Miasto / „Opis
projektu i zakres usług" / Data — bez osobnego wiersza z bulletami zakresu roli.
Opis i zakres trafiają w całości do pola „Opis projektu i zakres usług".

- build_b2b_templates: usunięty wiersz scope (DOCX + HTML) → re-run 4 artefakty.
- FE: usunięte osierocone pole „Zakres usług (PL/EN)" w generatorze (karta
  „Rola / Stanowisko" tylko z wyborem roli; rola dalej wstępnie wypełnia opis).
  Edytor katalogu zakresów ról (admin) zostaje — zakresy nadal zasilają
  smart-prefill opisu.
- testy: asercje scope-row → asercje „brak wiersza zakresu + opis w Zał.3".

Zweryfikowane render DOCX: Zał.3 = [Klient, Miasto, Opis, Data]; 13 testów OK;
tsc + eslint + next build OK.

Co-Authored-By: Claude Opus 4.8 (1M context) <noreply@anthropic.com>
</commit_message>
<xml_diff>
--- a/backend/app/templates/contract/umowa_b2b_en.docx
+++ b/backend/app/templates/contract/umowa_b2b_en.docx
@@ -8861,38 +8861,6 @@
                 <w:szCs w:val="20"/>
               </w:rPr>
               <w:t>{{ contract.start_date | pl_date }}</w:t>
-            </w:r>
-          </w:p>
-        </w:tc>
-      </w:tr>
-      <w:tr>
-        <w:tc>
-          <w:tcPr>
-            <w:tcW w:type="dxa" w:w="3703"/>
-          </w:tcPr>
-          <w:p>
-            <w:r>
-              <w:t>Detailed scope of Services:</w:t>
-            </w:r>
-          </w:p>
-        </w:tc>
-        <w:tc>
-          <w:tcPr>
-            <w:tcW w:type="dxa" w:w="5363"/>
-          </w:tcPr>
-          <w:p>
-            <w:r>
-              <w:t>{%p for it in b2b.scope_items %}</w:t>
-            </w:r>
-          </w:p>
-          <w:p>
-            <w:r>
-              <w:t>•  {{ it }}</w:t>
-            </w:r>
-          </w:p>
-          <w:p>
-            <w:r>
-              <w:t>{%p endfor %}</w:t>
             </w:r>
           </w:p>
         </w:tc>

</xml_diff>

<commit_message>
fix(b2b-generator): usuń wiersz „Szczegółowy zakres Usług" z Załącznika nr 3 (#452)
Decyzja Artura (2026-06-06): w Zał.3 ma być tylko Klient / Miasto / „Opis
projektu i zakres usług" / Data — bez osobnego wiersza z bulletami zakresu roli.
Opis i zakres trafiają w całości do pola „Opis projektu i zakres usług".

- build_b2b_templates: usunięty wiersz scope (DOCX + HTML) → re-run 4 artefakty.
- FE: usunięte osierocone pole „Zakres usług (PL/EN)" w generatorze (karta
  „Rola / Stanowisko" tylko z wyborem roli; rola dalej wstępnie wypełnia opis).
  Edytor katalogu zakresów ról (admin) zostaje — zakresy nadal zasilają
  smart-prefill opisu.
- testy: asercje scope-row → asercje „brak wiersza zakresu + opis w Zał.3".

Zweryfikowane render DOCX: Zał.3 = [Klient, Miasto, Opis, Data]; 13 testów OK;
tsc + eslint + next build OK.

Co-authored-by: Claude Opus 4.8 (1M context) <noreply@anthropic.com>
</commit_message>
<xml_diff>
--- a/backend/app/templates/contract/umowa_b2b_en.docx
+++ b/backend/app/templates/contract/umowa_b2b_en.docx
@@ -8861,38 +8861,6 @@
                 <w:szCs w:val="20"/>
               </w:rPr>
               <w:t>{{ contract.start_date | pl_date }}</w:t>
-            </w:r>
-          </w:p>
-        </w:tc>
-      </w:tr>
-      <w:tr>
-        <w:tc>
-          <w:tcPr>
-            <w:tcW w:type="dxa" w:w="3703"/>
-          </w:tcPr>
-          <w:p>
-            <w:r>
-              <w:t>Detailed scope of Services:</w:t>
-            </w:r>
-          </w:p>
-        </w:tc>
-        <w:tc>
-          <w:tcPr>
-            <w:tcW w:type="dxa" w:w="5363"/>
-          </w:tcPr>
-          <w:p>
-            <w:r>
-              <w:t>{%p for it in b2b.scope_items %}</w:t>
-            </w:r>
-          </w:p>
-          <w:p>
-            <w:r>
-              <w:t>•  {{ it }}</w:t>
-            </w:r>
-          </w:p>
-          <w:p>
-            <w:r>
-              <w:t>{%p endfor %}</w:t>
             </w:r>
           </w:p>
         </w:tc>

</xml_diff>

<commit_message>
fix(b2b-generator): pełna nazwa spółki „B2B.net S.A." we wszystkich draftach
Zgłoszenie rekruterki: w draftach umów pełna nazwa spółki była „B2B.NET
S.A.". Ma być „B2B.net S.A." (małe „net"). Skrót „B2BNET" (termin
zdefiniowany w komparycji) zostaje bez zmian.

- szablony HTML PL/EN: forma z kropką „B2B.NET" → „B2B.net" (także gdy
  rozbita na <strong>…</strong>); skrót „B2BNET" nietknięty.
- szablony DOCX PL/EN: run-aware zamiana „NET"→„net" w „B2B.NET" (równej
  długości, zachowuje pogrubienie; nazwa bywa rozbita na kilka runów).
- clause_override_content.py: podpis B2BNET w Załączniku Aliora.
- build_b2b_templates.py: normalize_company_name() — rebuild ze źródeł
  prawnika nie cofnie zmiany.
- testy: regresja „B2B.net S.A." w DOCX+HTML (PL/EN), brak „B2B.NET",
  „B2BNET" zachowany.

Świadomie pozostawione: §7 (DPA) „Administratorem … jest B2BNET S.A."
(skrót + S.A.) — zgodnie z prośbą, by skrót „B2BNET" został.
</commit_message>
<xml_diff>
--- a/backend/app/templates/contract/umowa_b2b_en.docx
+++ b/backend/app/templates/contract/umowa_b2b_en.docx
@@ -330,7 +330,7 @@
           <w:szCs w:val="20"/>
           <w:lang w:val="en-US"/>
         </w:rPr>
-        <w:t>NET</w:t>
+        <w:t>net</w:t>
       </w:r>
       <w:r>
         <w:rPr>
@@ -5550,7 +5550,7 @@
           <w:szCs w:val="20"/>
           <w:lang w:val="en-US"/>
         </w:rPr>
-        <w:t>B2B.NET S.A.</w:t>
+        <w:t>B2B.net S.A.</w:t>
       </w:r>
       <w:r>
         <w:rPr>
@@ -6438,7 +6438,7 @@
           <w:szCs w:val="22"/>
           <w:lang w:val="en-US"/>
         </w:rPr>
-        <w:t>Representative of B2B.NET S.A.</w:t>
+        <w:t>Representative of B2B.net S.A.</w:t>
       </w:r>
       <w:r>
         <w:rPr>
@@ -6844,7 +6844,7 @@
           <w:szCs w:val="20"/>
           <w:lang w:val="en-US"/>
         </w:rPr>
-        <w:t>NET S.A</w:t>
+        <w:t>net S.A</w:t>
       </w:r>
       <w:r>
         <w:rPr>
@@ -8196,7 +8196,7 @@
           <w:szCs w:val="20"/>
           <w:lang w:val="en-US"/>
         </w:rPr>
-        <w:t xml:space="preserve">         B2B.NET S.A</w:t>
+        <w:t xml:space="preserve">         B2B.net S.A</w:t>
       </w:r>
       <w:r>
         <w:rPr>
@@ -9042,7 +9042,7 @@
           <w:sz w:val="20"/>
           <w:szCs w:val="20"/>
         </w:rPr>
-        <w:t>B2B.NET S.A.</w:t>
+        <w:t>B2B.net S.A.</w:t>
       </w:r>
       <w:r>
         <w:tab/>
@@ -9089,6 +9089,9 @@
       <w:headerReference w:type="even" r:id="rId11"/>
       <w:headerReference w:type="default" r:id="rId12"/>
       <w:footerReference w:type="default" r:id="rId13"/>
+      <w:headerReference w:type="first" r:id="rId16"/>
+      <w:footerReference w:type="first" r:id="rId17"/>
+      <w:footerReference w:type="even" r:id="rId18"/>
       <w:pgSz w:w="11906" w:h="16838"/>
       <w:pgMar w:top="1107" w:right="1417" w:bottom="1417" w:left="1417" w:header="454" w:footer="708" w:gutter="0"/>
       <w:cols w:space="708"/>
@@ -9228,6 +9231,26 @@
       </w:rPr>
       <w:t>, www.B2Bnetwork.pl</w:t>
     </w:r>
+  </w:p>
+</w:ftr>
+</file>
+
+<file path=word/footer2.xml><?xml version="1.0" encoding="utf-8"?>
+<w:ftr xmlns:m="http://schemas.openxmlformats.org/officeDocument/2006/math" xmlns:mc="http://schemas.openxmlformats.org/markup-compatibility/2006" xmlns:mo="http://schemas.microsoft.com/office/mac/office/2008/main" xmlns:mv="urn:schemas-microsoft-com:mac:vml" xmlns:o="urn:schemas-microsoft-com:office:office" xmlns:r="http://schemas.openxmlformats.org/officeDocument/2006/relationships" xmlns:v="urn:schemas-microsoft-com:vml" xmlns:w10="urn:schemas-microsoft-com:office:word" xmlns:w14="http://schemas.microsoft.com/office/word/2010/wordml" xmlns:w="http://schemas.openxmlformats.org/wordprocessingml/2006/main" xmlns:wne="http://schemas.microsoft.com/office/word/2006/wordml" xmlns:wp14="http://schemas.microsoft.com/office/word/2010/wordprocessingDrawing" xmlns:wp="http://schemas.openxmlformats.org/drawingml/2006/wordprocessingDrawing" xmlns:wpc="http://schemas.microsoft.com/office/word/2010/wordprocessingCanvas" xmlns:wpg="http://schemas.microsoft.com/office/word/2010/wordprocessingGroup" xmlns:wpi="http://schemas.microsoft.com/office/word/2010/wordprocessingInk" xmlns:wps="http://schemas.microsoft.com/office/word/2010/wordprocessingShape" mc:Ignorable="w14 wp14">
+  <w:p>
+    <w:pPr>
+      <w:pStyle w:val="Footer"/>
+    </w:pPr>
+  </w:p>
+</w:ftr>
+</file>
+
+<file path=word/footer3.xml><?xml version="1.0" encoding="utf-8"?>
+<w:ftr xmlns:m="http://schemas.openxmlformats.org/officeDocument/2006/math" xmlns:mc="http://schemas.openxmlformats.org/markup-compatibility/2006" xmlns:mo="http://schemas.microsoft.com/office/mac/office/2008/main" xmlns:mv="urn:schemas-microsoft-com:mac:vml" xmlns:o="urn:schemas-microsoft-com:office:office" xmlns:r="http://schemas.openxmlformats.org/officeDocument/2006/relationships" xmlns:v="urn:schemas-microsoft-com:vml" xmlns:w10="urn:schemas-microsoft-com:office:word" xmlns:w14="http://schemas.microsoft.com/office/word/2010/wordml" xmlns:w="http://schemas.openxmlformats.org/wordprocessingml/2006/main" xmlns:wne="http://schemas.microsoft.com/office/word/2006/wordml" xmlns:wp14="http://schemas.microsoft.com/office/word/2010/wordprocessingDrawing" xmlns:wp="http://schemas.openxmlformats.org/drawingml/2006/wordprocessingDrawing" xmlns:wpc="http://schemas.microsoft.com/office/word/2010/wordprocessingCanvas" xmlns:wpg="http://schemas.microsoft.com/office/word/2010/wordprocessingGroup" xmlns:wpi="http://schemas.microsoft.com/office/word/2010/wordprocessingInk" xmlns:wps="http://schemas.microsoft.com/office/word/2010/wordprocessingShape" mc:Ignorable="w14 wp14">
+  <w:p>
+    <w:pPr>
+      <w:pStyle w:val="Footer"/>
+    </w:pPr>
   </w:p>
 </w:ftr>
 </file>
@@ -9413,6 +9436,16 @@
     <w:pPr>
       <w:pStyle w:val="Nagwek"/>
       <w:ind w:right="360"/>
+    </w:pPr>
+  </w:p>
+</w:hdr>
+</file>
+
+<file path=word/header3.xml><?xml version="1.0" encoding="utf-8"?>
+<w:hdr xmlns:m="http://schemas.openxmlformats.org/officeDocument/2006/math" xmlns:mc="http://schemas.openxmlformats.org/markup-compatibility/2006" xmlns:mo="http://schemas.microsoft.com/office/mac/office/2008/main" xmlns:mv="urn:schemas-microsoft-com:mac:vml" xmlns:o="urn:schemas-microsoft-com:office:office" xmlns:r="http://schemas.openxmlformats.org/officeDocument/2006/relationships" xmlns:v="urn:schemas-microsoft-com:vml" xmlns:w10="urn:schemas-microsoft-com:office:word" xmlns:w14="http://schemas.microsoft.com/office/word/2010/wordml" xmlns:w="http://schemas.openxmlformats.org/wordprocessingml/2006/main" xmlns:wne="http://schemas.microsoft.com/office/word/2006/wordml" xmlns:wp14="http://schemas.microsoft.com/office/word/2010/wordprocessingDrawing" xmlns:wp="http://schemas.openxmlformats.org/drawingml/2006/wordprocessingDrawing" xmlns:wpc="http://schemas.microsoft.com/office/word/2010/wordprocessingCanvas" xmlns:wpg="http://schemas.microsoft.com/office/word/2010/wordprocessingGroup" xmlns:wpi="http://schemas.microsoft.com/office/word/2010/wordprocessingInk" xmlns:wps="http://schemas.microsoft.com/office/word/2010/wordprocessingShape" mc:Ignorable="w14 wp14">
+  <w:p>
+    <w:pPr>
+      <w:pStyle w:val="Header"/>
     </w:pPr>
   </w:p>
 </w:hdr>

</xml_diff>

<commit_message>
feat(b2b-generator): „pod adresem do doręczeń” dla JDG bez stałego miejsca w CEIDG
Partner JDG, który w CEIDG ma tylko adres do doręczeń, jest w komparycji
umowy i w Załączniku nr 2 (DPA) opisany „zarejestrowaną w CEIDG pod adresem
do doręczeń” (EN: „at the address for service”). To samo zdanie w aneksach
(stawka, data startu, podwykonawca), wypowiedzeniu i porozumieniu.

- lookup: rodzaj adresu z karty firmy CEIDG (biznes.gov.pl GetCompanyDetails),
  bo Biała Lista MF zwraca adres do doręczeń jako zwykły workingAddress,
- formularz JDG: „Adres z CEIDG” + przełącznik ustawiany z rejestru,
  ręczna zmiana zostawia ślad; spółka bez zmian,
- `partner_address_for_service` w payloadzie (ponowne pobranie i poprawka
  biorą ten sam wybór); dokumenty przejmują go z umowy bazowej i z CEIDG,
- reguła docs/claude/kontrakty/adres-do-doreczen-z-ceidg.md, przewodnik Jarvisa.

Co-Authored-By: Claude Opus 5.5 <noreply@anthropic.com>
</commit_message>
<xml_diff>
--- a/backend/app/templates/contract/umowa_b2b_en.docx
+++ b/backend/app/templates/contract/umowa_b2b_en.docx
@@ -568,7 +568,7 @@
           <w:b w:val="0"/>
           <w:sz w:val="20"/>
         </w:rPr>
-        <w:t>{% if b2b.is_company is defined and b2b.is_company %}with its registered office in {{ b2b.company.seat or '………' }}, at the address: {{ candidate.business_address or '………' }}, entered in the Register of Entrepreneurs of the National Court Register kept by {{ b2b.company.registry_court or '………' }}, under KRS number: {{ b2b.company.krs or '………' }}, NIP: {{ candidate.nip or '………' }}, REGON: {{ candidate.regon or '………' }}, with share capital of {{ b2b.company.share_capital or '………' }}, represented by {{ b2b.company.representation or '………' }}, {% else %}conducting business activity under the name: {{ candidate.legal_name or '………' }}, registered in the Central Register and Information on Economic Activity at the address: {{ candidate.business_address or '………' }}, NIP: {{ candidate.nip or '………' }}, REGON: {{ candidate.regon or '………' }}, {% endif %}</w:t>
+        <w:t>{% if b2b.is_company is defined and b2b.is_company %}with its registered office in {{ b2b.company.seat or '………' }}, at the address: {{ candidate.business_address or '………' }}, entered in the Register of Entrepreneurs of the National Court Register kept by {{ b2b.company.registry_court or '………' }}, under KRS number: {{ b2b.company.krs or '………' }}, NIP: {{ candidate.nip or '………' }}, REGON: {{ candidate.regon or '………' }}, with share capital of {{ b2b.company.share_capital or '………' }}, represented by {{ b2b.company.representation or '………' }}, {% else %}conducting business activity under the name: {{ candidate.legal_name or '………' }}, registered in the Central Register and Information on Economic Activity at the address{% if b2b.address_for_service is defined and b2b.address_for_service %} for service{% endif %}: {{ candidate.business_address or '………' }}, NIP: {{ candidate.nip or '………' }}, REGON: {{ candidate.regon or '………' }}, {% endif %}</w:t>
       </w:r>
       <w:r>
         <w:rPr>
@@ -7000,7 +7000,7 @@
         <w:rPr>
           <w:b w:val="0"/>
         </w:rPr>
-        <w:t>{% if b2b.is_company is defined and b2b.is_company %}with its registered office in {{ b2b.company.seat or '………' }}, at the address: {{ candidate.business_address or '………' }}, entered in the Register of Entrepreneurs of the National Court Register kept by {{ b2b.company.registry_court or '………' }}, under KRS number: {{ b2b.company.krs or '………' }}, NIP: {{ candidate.nip or '………' }}, REGON: {{ candidate.regon or '………' }}, with share capital of {{ b2b.company.share_capital or '………' }}, represented by {{ b2b.company.representation or '………' }}, {% else %}conducting business activity under the name: {{ candidate.legal_name or '………' }}, registered in the Central Register and Information on Economic Activity at the address: {{ candidate.business_address or '………' }}, NIP: {{ candidate.nip or '………' }}, REGON: {{ candidate.regon or '………' }}, {% endif %}</w:t>
+        <w:t>{% if b2b.is_company is defined and b2b.is_company %}with its registered office in {{ b2b.company.seat or '………' }}, at the address: {{ candidate.business_address or '………' }}, entered in the Register of Entrepreneurs of the National Court Register kept by {{ b2b.company.registry_court or '………' }}, under KRS number: {{ b2b.company.krs or '………' }}, NIP: {{ candidate.nip or '………' }}, REGON: {{ candidate.regon or '………' }}, with share capital of {{ b2b.company.share_capital or '………' }}, represented by {{ b2b.company.representation or '………' }}, {% else %}conducting business activity under the name: {{ candidate.legal_name or '………' }}, registered in the Central Register and Information on Economic Activity at the address{% if b2b.address_for_service is defined and b2b.address_for_service %} for service{% endif %}: {{ candidate.business_address or '………' }}, NIP: {{ candidate.nip or '………' }}, REGON: {{ candidate.regon or '………' }}, {% endif %}</w:t>
       </w:r>
     </w:p>
     <w:p>

</xml_diff>